<commit_message>
Update AquiferOpenBibleDictionary content and metadata for 2026-05-07 release
</commit_message>
<xml_diff>
--- a/zht/docx/002.content.docx
+++ b/zht/docx/002.content.docx
@@ -2645,6 +2645,369 @@
         <w:rPr>
           <w:lang w:val="zh_TW" w:bidi="zh_TW"/>
         </w:rPr>
+        <w:t>埃及河</w:t>
+      </w:r>
+      <w:r>
+        <w:rPr>
+          <w:lang w:val="zh_TW" w:bidi="zh_TW"/>
+        </w:rPr>
+      </w:r>
+    </w:p>
+    <w:p>
+      <w:pPr>
+        <w:pStyle w:val="ListNumber"/>
+        <w:numPr>
+          <w:ilvl w:val="0"/>
+          <w:numId w:val="15"/>
+        </w:numPr>
+        <w:spacing w:line="240" w:lineRule="auto"/>
+        <w:ind w:left="720"/>
+      </w:pPr>
+      <w:r>
+        <w:rPr>
+          <w:lang w:val="zh_TW" w:bidi="zh_TW"/>
+        </w:rPr>
+      </w:r>
+      <w:r>
+        <w:rPr>
+          <w:lang w:val="zh_TW" w:bidi="zh_TW"/>
+        </w:rPr>
+        <w:t>在</w:t>
+      </w:r>
+      <w:hyperlink r:id="rId76">
+        <w:r>
+          <w:rPr>
+            <w:lang w:val="zh_TW" w:bidi="zh_TW"/>
+          </w:rPr>
+          <w:rPr>
+            <w:color w:val="0000EE"/>
+            <w:u w:val="single"/>
+          </w:rPr>
+          <w:t>創世記十五章18節</w:t>
+        </w:r>
+      </w:hyperlink>
+      <w:r>
+        <w:rPr>
+          <w:lang w:val="zh_TW" w:bidi="zh_TW"/>
+        </w:rPr>
+        <w:t>中，埃及邊界的別稱（可能是指尼羅河</w:t>
+      </w:r>
+      <w:r>
+        <w:rPr>
+          <w:lang w:val="zh_TW" w:bidi="zh_TW"/>
+        </w:rPr>
+        <w:t>〔</w:t>
+      </w:r>
+      <w:r>
+        <w:rPr>
+          <w:lang w:val="zh_TW" w:bidi="zh_TW"/>
+        </w:rPr>
+        <w:t>Nile River</w:t>
+      </w:r>
+      <w:r>
+        <w:rPr>
+          <w:lang w:val="zh_TW" w:bidi="zh_TW"/>
+        </w:rPr>
+        <w:t>〕</w:t>
+      </w:r>
+      <w:r>
+        <w:rPr>
+          <w:lang w:val="zh_TW" w:bidi="zh_TW"/>
+        </w:rPr>
+        <w:t>）。</w:t>
+      </w:r>
+    </w:p>
+    <w:p>
+      <w:pPr>
+        <w:pStyle w:val="ListNumber"/>
+        <w:spacing w:line="240" w:lineRule="auto"/>
+        <w:ind w:left="720"/>
+      </w:pPr>
+      <w:r>
+        <w:rPr>
+          <w:lang w:val="zh_TW" w:bidi="zh_TW"/>
+        </w:rPr>
+      </w:r>
+      <w:r>
+        <w:rPr>
+          <w:lang w:val="zh_TW" w:bidi="zh_TW"/>
+        </w:rPr>
+        <w:t>埃及小河（the brook of Egypt）的別稱。</w:t>
+      </w:r>
+      <w:r>
+        <w:rPr>
+          <w:i/>
+          <w:lang w:val="zh_TW" w:bidi="zh_TW"/>
+        </w:rPr>
+        <w:t>見</w:t>
+      </w:r>
+      <w:r>
+        <w:rPr>
+          <w:lang w:val="zh_TW" w:bidi="zh_TW"/>
+        </w:rPr>
+        <w:t>埃及小河</w:t>
+      </w:r>
+      <w:r>
+        <w:rPr>
+          <w:lang w:val="zh_TW" w:bidi="zh_TW"/>
+        </w:rPr>
+        <w:t>。</w:t>
+      </w:r>
+      <w:r>
+        <w:rPr>
+          <w:lang w:val="zh_TW" w:bidi="zh_TW"/>
+        </w:rPr>
+      </w:r>
+      <w:r>
+        <w:rPr>
+          <w:lang w:val="zh_TW" w:bidi="zh_TW"/>
+        </w:rPr>
+      </w:r>
+    </w:p>
+    <w:p>
+      <w:pPr/>
+      <w:r>
+        <w:rPr>
+          <w:lang w:val="zh_TW" w:bidi="zh_TW"/>
+        </w:rPr>
+      </w:r>
+    </w:p>
+    <w:p>
+      <w:pPr>
+        <w:pStyle w:val="Heading2"/>
+      </w:pPr>
+      <w:r>
+        <w:rPr>
+          <w:lang w:val="zh_TW" w:bidi="zh_TW"/>
+        </w:rPr>
+        <w:t>埃及小河</w:t>
+      </w:r>
+      <w:r>
+        <w:rPr>
+          <w:lang w:val="zh_TW" w:bidi="zh_TW"/>
+        </w:rPr>
+      </w:r>
+    </w:p>
+    <w:p>
+      <w:pPr/>
+      <w:r>
+        <w:rPr>
+          <w:lang w:val="zh_TW" w:bidi="zh_TW"/>
+        </w:rPr>
+      </w:r>
+      <w:r>
+        <w:rPr>
+          <w:lang w:val="zh_TW" w:bidi="zh_TW"/>
+        </w:rPr>
+        <w:t>埃及小河形成了以色列南地曠野與西奈半島之間的天然邊界，它位於迦薩（Gaza）西南約50英里（80.5公里）。埃及小河（現今稱為阿里什河谷〔Wadi el-Arish〕）只在雨季才有水流（</w:t>
+      </w:r>
+      <w:hyperlink r:id="rId77">
+        <w:r>
+          <w:rPr>
+            <w:lang w:val="zh_TW" w:bidi="zh_TW"/>
+          </w:rPr>
+          <w:rPr>
+            <w:color w:val="0000EE"/>
+            <w:u w:val="single"/>
+          </w:rPr>
+          <w:t>民34:5</w:t>
+        </w:r>
+      </w:hyperlink>
+      <w:r>
+        <w:rPr>
+          <w:lang w:val="zh_TW" w:bidi="zh_TW"/>
+        </w:rPr>
+        <w:t>；</w:t>
+      </w:r>
+      <w:hyperlink r:id="rId78">
+        <w:r>
+          <w:rPr>
+            <w:lang w:val="zh_TW" w:bidi="zh_TW"/>
+          </w:rPr>
+          <w:rPr>
+            <w:color w:val="0000EE"/>
+            <w:u w:val="single"/>
+          </w:rPr>
+          <w:t>書15:4</w:t>
+        </w:r>
+      </w:hyperlink>
+      <w:r>
+        <w:rPr>
+          <w:lang w:val="zh_TW" w:bidi="zh_TW"/>
+        </w:rPr>
+        <w:t>、</w:t>
+      </w:r>
+      <w:hyperlink r:id="rId78">
+        <w:r>
+          <w:rPr>
+            <w:lang w:val="zh_TW" w:bidi="zh_TW"/>
+          </w:rPr>
+          <w:rPr>
+            <w:color w:val="0000EE"/>
+            <w:u w:val="single"/>
+          </w:rPr>
+          <w:t>47</w:t>
+        </w:r>
+      </w:hyperlink>
+      <w:r>
+        <w:rPr>
+          <w:lang w:val="zh_TW" w:bidi="zh_TW"/>
+        </w:rPr>
+        <w:t>；</w:t>
+      </w:r>
+      <w:hyperlink r:id="rId79">
+        <w:r>
+          <w:rPr>
+            <w:lang w:val="zh_TW" w:bidi="zh_TW"/>
+          </w:rPr>
+          <w:rPr>
+            <w:color w:val="0000EE"/>
+            <w:u w:val="single"/>
+          </w:rPr>
+          <w:t>王上8:65</w:t>
+        </w:r>
+      </w:hyperlink>
+      <w:r>
+        <w:rPr>
+          <w:lang w:val="zh_TW" w:bidi="zh_TW"/>
+        </w:rPr>
+        <w:t>；</w:t>
+      </w:r>
+      <w:hyperlink r:id="rId80">
+        <w:r>
+          <w:rPr>
+            <w:lang w:val="zh_TW" w:bidi="zh_TW"/>
+          </w:rPr>
+          <w:rPr>
+            <w:color w:val="0000EE"/>
+            <w:u w:val="single"/>
+          </w:rPr>
+          <w:t>王下24:7</w:t>
+        </w:r>
+      </w:hyperlink>
+      <w:r>
+        <w:rPr>
+          <w:lang w:val="zh_TW" w:bidi="zh_TW"/>
+        </w:rPr>
+        <w:t>；</w:t>
+      </w:r>
+      <w:hyperlink r:id="rId81">
+        <w:r>
+          <w:rPr>
+            <w:lang w:val="zh_TW" w:bidi="zh_TW"/>
+          </w:rPr>
+          <w:rPr>
+            <w:color w:val="0000EE"/>
+            <w:u w:val="single"/>
+          </w:rPr>
+          <w:t>代下7:8</w:t>
+        </w:r>
+      </w:hyperlink>
+      <w:r>
+        <w:rPr>
+          <w:lang w:val="zh_TW" w:bidi="zh_TW"/>
+        </w:rPr>
+        <w:t>；</w:t>
+      </w:r>
+      <w:hyperlink r:id="rId82">
+        <w:r>
+          <w:rPr>
+            <w:lang w:val="zh_TW" w:bidi="zh_TW"/>
+          </w:rPr>
+          <w:rPr>
+            <w:color w:val="0000EE"/>
+            <w:u w:val="single"/>
+          </w:rPr>
+          <w:t>賽27:12</w:t>
+        </w:r>
+      </w:hyperlink>
+      <w:r>
+        <w:rPr>
+          <w:lang w:val="zh_TW" w:bidi="zh_TW"/>
+        </w:rPr>
+        <w:t>；</w:t>
+      </w:r>
+      <w:hyperlink r:id="rId83">
+        <w:r>
+          <w:rPr>
+            <w:lang w:val="zh_TW" w:bidi="zh_TW"/>
+          </w:rPr>
+          <w:rPr>
+            <w:color w:val="0000EE"/>
+            <w:u w:val="single"/>
+          </w:rPr>
+          <w:t>結47:19</w:t>
+        </w:r>
+      </w:hyperlink>
+      <w:r>
+        <w:rPr>
+          <w:lang w:val="zh_TW" w:bidi="zh_TW"/>
+        </w:rPr>
+        <w:t>，</w:t>
+      </w:r>
+      <w:hyperlink r:id="rId84">
+        <w:r>
+          <w:rPr>
+            <w:lang w:val="zh_TW" w:bidi="zh_TW"/>
+          </w:rPr>
+          <w:rPr>
+            <w:color w:val="0000EE"/>
+            <w:u w:val="single"/>
+          </w:rPr>
+          <w:t>48:28</w:t>
+        </w:r>
+      </w:hyperlink>
+      <w:r>
+        <w:rPr>
+          <w:lang w:val="zh_TW" w:bidi="zh_TW"/>
+        </w:rPr>
+        <w:t>）。在</w:t>
+      </w:r>
+      <w:hyperlink r:id="rId76">
+        <w:r>
+          <w:rPr>
+            <w:lang w:val="zh_TW" w:bidi="zh_TW"/>
+          </w:rPr>
+          <w:rPr>
+            <w:color w:val="0000EE"/>
+            <w:u w:val="single"/>
+          </w:rPr>
+          <w:t>創世記十五章18節</w:t>
+        </w:r>
+      </w:hyperlink>
+      <w:r>
+        <w:rPr>
+          <w:lang w:val="zh_TW" w:bidi="zh_TW"/>
+        </w:rPr>
+        <w:t>中，則使用另一個希伯來文詞語來表示常年流動的河，神在那裡向族長亞伯拉罕說明應許之地的疆界。那處經文指的可能是尼羅河最東的一條支流（佩盧西亞支流〔Pelusiac〕），它是在今日的塞得港（Port Said）附近流入地中海，這也可能是指標示埃及邊界的一條古代防禦工事線。</w:t>
+      </w:r>
+      <w:r>
+        <w:rPr>
+          <w:lang w:val="zh_TW" w:bidi="zh_TW"/>
+        </w:rPr>
+      </w:r>
+      <w:r>
+        <w:rPr>
+          <w:lang w:val="zh_TW" w:bidi="zh_TW"/>
+        </w:rPr>
+      </w:r>
+    </w:p>
+    <w:p>
+      <w:pPr/>
+      <w:r>
+        <w:rPr>
+          <w:lang w:val="zh_TW" w:bidi="zh_TW"/>
+        </w:rPr>
+      </w:r>
+    </w:p>
+    <w:p>
+      <w:pPr>
+        <w:pStyle w:val="Heading2"/>
+      </w:pPr>
+      <w:r>
+        <w:rPr>
+          <w:lang w:val="zh_TW" w:bidi="zh_TW"/>
+        </w:rPr>
         <w:t>艾</w:t>
       </w:r>
       <w:r>
@@ -2660,7 +3023,7 @@
           <w:lang w:val="zh_TW" w:bidi="zh_TW"/>
         </w:rPr>
       </w:r>
-      <w:hyperlink r:id="rId76">
+      <w:hyperlink r:id="rId85">
         <w:r>
           <w:rPr>
             <w:lang w:val="zh_TW" w:bidi="zh_TW"/>
@@ -2678,7 +3041,7 @@
         </w:rPr>
         <w:t>和</w:t>
       </w:r>
-      <w:hyperlink r:id="rId77">
+      <w:hyperlink r:id="rId86">
         <w:r>
           <w:rPr>
             <w:lang w:val="zh_TW" w:bidi="zh_TW"/>
@@ -2742,6 +3105,307 @@
         <w:rPr>
           <w:lang w:val="zh_TW" w:bidi="zh_TW"/>
         </w:rPr>
+        <w:t>艾城</w:t>
+      </w:r>
+      <w:r>
+        <w:rPr>
+          <w:lang w:val="zh_TW" w:bidi="zh_TW"/>
+        </w:rPr>
+      </w:r>
+    </w:p>
+    <w:p>
+      <w:pPr/>
+      <w:r>
+        <w:rPr>
+          <w:lang w:val="zh_TW" w:bidi="zh_TW"/>
+        </w:rPr>
+      </w:r>
+      <w:r>
+        <w:rPr>
+          <w:lang w:val="zh_TW" w:bidi="zh_TW"/>
+        </w:rPr>
+        <w:t>一座迦南城，早在亞伯拉罕時代之前便已存在（</w:t>
+      </w:r>
+      <w:hyperlink r:id="rId85">
+        <w:r>
+          <w:rPr>
+            <w:lang w:val="zh_TW" w:bidi="zh_TW"/>
+          </w:rPr>
+          <w:rPr>
+            <w:color w:val="0000EE"/>
+            <w:u w:val="single"/>
+          </w:rPr>
+          <w:t>創12:8</w:t>
+        </w:r>
+      </w:hyperlink>
+      <w:r>
+        <w:rPr>
+          <w:lang w:val="zh_TW" w:bidi="zh_TW"/>
+        </w:rPr>
+        <w:t>；</w:t>
+      </w:r>
+      <w:hyperlink r:id="rId86">
+        <w:r>
+          <w:rPr>
+            <w:lang w:val="zh_TW" w:bidi="zh_TW"/>
+          </w:rPr>
+          <w:rPr>
+            <w:color w:val="0000EE"/>
+            <w:u w:val="single"/>
+          </w:rPr>
+          <w:t>13:3</w:t>
+        </w:r>
+      </w:hyperlink>
+      <w:r>
+        <w:rPr>
+          <w:lang w:val="zh_TW" w:bidi="zh_TW"/>
+        </w:rPr>
+        <w:t>）。「艾」的意思是「廢墟」，可能表示那裡是一處重要或顯眼的荒涼遺址。亞伯拉罕行經該地時，艾城與其他迦南城邑（如示劍、伯特利、耶路撒冷）的人並未攔阻他。或許亞伯拉罕曾與當地諸王交涉，表明自己來意和平；也可能因他隨行人眾，使迦南人不敢與之爭戰。</w:t>
+      </w:r>
+    </w:p>
+    <w:p>
+      <w:pPr/>
+      <w:r>
+        <w:rPr>
+          <w:lang w:val="zh_TW" w:bidi="zh_TW"/>
+        </w:rPr>
+      </w:r>
+      <w:r>
+        <w:rPr>
+          <w:lang w:val="zh_TW" w:bidi="zh_TW"/>
+        </w:rPr>
+        <w:t>後來約書亞率領以色列人進入迦南時，攻打艾城；這是他們征戰的第二座城。以色列人初次攻打艾城失敗，原因在於一名以色列人亞干違背上帝，私自取了耶利哥當滅之物。處置亞干後，以色列人再攻打艾城便獲勝（</w:t>
+      </w:r>
+      <w:hyperlink r:id="rId87">
+        <w:r>
+          <w:rPr>
+            <w:lang w:val="zh_TW" w:bidi="zh_TW"/>
+          </w:rPr>
+          <w:rPr>
+            <w:color w:val="0000EE"/>
+            <w:u w:val="single"/>
+          </w:rPr>
+          <w:t>書7:1–8:2</w:t>
+        </w:r>
+      </w:hyperlink>
+      <w:r>
+        <w:rPr>
+          <w:lang w:val="zh_TW" w:bidi="zh_TW"/>
+        </w:rPr>
+        <w:t>）。約書亞擒拿艾城王，將其處死，並焚燒全城（</w:t>
+      </w:r>
+      <w:hyperlink r:id="rId88">
+        <w:r>
+          <w:rPr>
+            <w:lang w:val="zh_TW" w:bidi="zh_TW"/>
+          </w:rPr>
+          <w:rPr>
+            <w:color w:val="0000EE"/>
+            <w:u w:val="single"/>
+          </w:rPr>
+          <w:t>書10:1</w:t>
+        </w:r>
+      </w:hyperlink>
+      <w:r>
+        <w:rPr>
+          <w:lang w:val="zh_TW" w:bidi="zh_TW"/>
+        </w:rPr>
+        <w:t>）。</w:t>
+      </w:r>
+    </w:p>
+    <w:p>
+      <w:pPr/>
+      <w:r>
+        <w:rPr>
+          <w:lang w:val="zh_TW" w:bidi="zh_TW"/>
+        </w:rPr>
+      </w:r>
+      <w:r>
+        <w:rPr>
+          <w:lang w:val="zh_TW" w:bidi="zh_TW"/>
+        </w:rPr>
+        <w:t>到掃羅、大衛、所羅門作王的時期，艾城一帶似乎又有人重建居住。此城在不同時期可能是以不同名稱出現：</w:t>
+      </w:r>
+    </w:p>
+    <w:p>
+      <w:pPr>
+        <w:pStyle w:val="ListBullet"/>
+        <w:spacing w:line="240" w:lineRule="auto"/>
+        <w:ind w:left="720"/>
+      </w:pPr>
+      <w:r>
+        <w:rPr>
+          <w:lang w:val="zh_TW" w:bidi="zh_TW"/>
+        </w:rPr>
+      </w:r>
+      <w:r>
+        <w:rPr>
+          <w:lang w:val="zh_TW" w:bidi="zh_TW"/>
+        </w:rPr>
+        <w:t>迦薩（Ayyah）位於以法蓮的村莊（</w:t>
+      </w:r>
+      <w:hyperlink r:id="rId89">
+        <w:r>
+          <w:rPr>
+            <w:lang w:val="zh_TW" w:bidi="zh_TW"/>
+          </w:rPr>
+          <w:rPr>
+            <w:color w:val="0000EE"/>
+            <w:u w:val="single"/>
+          </w:rPr>
+          <w:t>代上7:28</w:t>
+        </w:r>
+      </w:hyperlink>
+      <w:r>
+        <w:rPr>
+          <w:lang w:val="zh_TW" w:bidi="zh_TW"/>
+        </w:rPr>
+        <w:t>）</w:t>
+      </w:r>
+    </w:p>
+    <w:p>
+      <w:pPr>
+        <w:pStyle w:val="ListBullet"/>
+        <w:spacing w:line="240" w:lineRule="auto"/>
+        <w:ind w:left="720"/>
+      </w:pPr>
+      <w:r>
+        <w:rPr>
+          <w:lang w:val="zh_TW" w:bidi="zh_TW"/>
+        </w:rPr>
+      </w:r>
+      <w:r>
+        <w:rPr>
+          <w:lang w:val="zh_TW" w:bidi="zh_TW"/>
+        </w:rPr>
+        <w:t>亞葉（Aiath）是亞述軍隊在前往耶路撒冷途中經過的村莊（</w:t>
+      </w:r>
+      <w:hyperlink r:id="rId90">
+        <w:r>
+          <w:rPr>
+            <w:lang w:val="zh_TW" w:bidi="zh_TW"/>
+          </w:rPr>
+          <w:rPr>
+            <w:color w:val="0000EE"/>
+            <w:u w:val="single"/>
+          </w:rPr>
+          <w:t>賽10:28</w:t>
+        </w:r>
+      </w:hyperlink>
+      <w:r>
+        <w:rPr>
+          <w:lang w:val="zh_TW" w:bidi="zh_TW"/>
+        </w:rPr>
+        <w:t>）</w:t>
+      </w:r>
+    </w:p>
+    <w:p>
+      <w:pPr>
+        <w:pStyle w:val="ListBullet"/>
+        <w:spacing w:line="240" w:lineRule="auto"/>
+        <w:ind w:left="720"/>
+      </w:pPr>
+      <w:r>
+        <w:rPr>
+          <w:lang w:val="zh_TW" w:bidi="zh_TW"/>
+        </w:rPr>
+      </w:r>
+      <w:r>
+        <w:rPr>
+          <w:lang w:val="zh_TW" w:bidi="zh_TW"/>
+        </w:rPr>
+        <w:t>亞雅（Aija）是便雅憫支派的人在從被擄歸回後居住的村莊（</w:t>
+      </w:r>
+      <w:hyperlink r:id="rId91">
+        <w:r>
+          <w:rPr>
+            <w:lang w:val="zh_TW" w:bidi="zh_TW"/>
+          </w:rPr>
+          <w:rPr>
+            <w:color w:val="0000EE"/>
+            <w:u w:val="single"/>
+          </w:rPr>
+          <w:t>尼11:31</w:t>
+        </w:r>
+      </w:hyperlink>
+      <w:r>
+        <w:rPr>
+          <w:lang w:val="zh_TW" w:bidi="zh_TW"/>
+        </w:rPr>
+        <w:t>）</w:t>
+      </w:r>
+    </w:p>
+    <w:p>
+      <w:pPr/>
+      <w:r>
+        <w:rPr>
+          <w:lang w:val="zh_TW" w:bidi="zh_TW"/>
+        </w:rPr>
+      </w:r>
+      <w:r>
+        <w:rPr>
+          <w:i/>
+          <w:lang w:val="zh_TW" w:bidi="zh_TW"/>
+        </w:rPr>
+        <w:t>另見</w:t>
+      </w:r>
+      <w:r>
+        <w:rPr>
+          <w:lang w:val="zh_TW" w:bidi="zh_TW"/>
+        </w:rPr>
+        <w:t xml:space="preserve"> </w:t>
+      </w:r>
+      <w:r>
+        <w:rPr>
+          <w:lang w:val="zh_TW" w:bidi="zh_TW"/>
+        </w:rPr>
+        <w:t>征服與分配土地</w:t>
+      </w:r>
+      <w:r>
+        <w:rPr>
+          <w:lang w:val="zh_TW" w:bidi="zh_TW"/>
+        </w:rPr>
+        <w:t>；</w:t>
+      </w:r>
+      <w:r>
+        <w:rPr>
+          <w:lang w:val="zh_TW" w:bidi="zh_TW"/>
+        </w:rPr>
+        <w:t>約書亞記</w:t>
+      </w:r>
+      <w:r>
+        <w:rPr>
+          <w:lang w:val="zh_TW" w:bidi="zh_TW"/>
+        </w:rPr>
+        <w:t>。</w:t>
+      </w:r>
+      <w:r>
+        <w:rPr>
+          <w:lang w:val="zh_TW" w:bidi="zh_TW"/>
+        </w:rPr>
+      </w:r>
+      <w:r>
+        <w:rPr>
+          <w:lang w:val="zh_TW" w:bidi="zh_TW"/>
+        </w:rPr>
+      </w:r>
+    </w:p>
+    <w:p>
+      <w:pPr/>
+      <w:r>
+        <w:rPr>
+          <w:lang w:val="zh_TW" w:bidi="zh_TW"/>
+        </w:rPr>
+      </w:r>
+    </w:p>
+    <w:p>
+      <w:pPr>
+        <w:pStyle w:val="Heading2"/>
+      </w:pPr>
+      <w:r>
+        <w:rPr>
+          <w:lang w:val="zh_TW" w:bidi="zh_TW"/>
+        </w:rPr>
         <w:t>愛</w:t>
       </w:r>
       <w:r>
@@ -2814,7 +3478,7 @@
         </w:rPr>
         <w:t>，也在雅歌中出現。希伯來文詞語hesed表達的是一種更高形式的愛，涉及忠誠、堅定和仁慈，有時被譯為「忠誠（loyalty，和合本譯為慈愛）」（</w:t>
       </w:r>
-      <w:hyperlink r:id="rId78">
+      <w:hyperlink r:id="rId92">
         <w:r>
           <w:rPr>
             <w:lang w:val="zh_TW" w:bidi="zh_TW"/>
@@ -2846,7 +3510,7 @@
         </w:rPr>
         <w:t>這個重要詞語的含義在</w:t>
       </w:r>
-      <w:hyperlink r:id="rId79">
+      <w:hyperlink r:id="rId93">
         <w:r>
           <w:rPr>
             <w:lang w:val="zh_TW" w:bidi="zh_TW"/>
@@ -2864,7 +3528,7 @@
         </w:rPr>
         <w:t>中表達得很清楚：「我必聘你永遠歸我為妻，以仁義、公平、慈愛、憐憫聘你歸我；也以誠實聘你歸我，你就必認識我─耶和華」；在</w:t>
       </w:r>
-      <w:hyperlink r:id="rId80">
+      <w:hyperlink r:id="rId94">
         <w:r>
           <w:rPr>
             <w:lang w:val="zh_TW" w:bidi="zh_TW"/>
@@ -2882,7 +3546,7 @@
         </w:rPr>
         <w:t>中，將慈愛與背叛作對比；以及在</w:t>
       </w:r>
-      <w:hyperlink r:id="rId81">
+      <w:hyperlink r:id="rId95">
         <w:r>
           <w:rPr>
             <w:lang w:val="zh_TW" w:bidi="zh_TW"/>
@@ -2900,7 +3564,7 @@
         </w:rPr>
         <w:t>中，提到立約的慈愛。神這種堅定不移、穩固的愛，與異教神祇那不可預測、反覆無常的情緒形成鮮明對比。Hesed不是對美、優點或仁慈的情感反應，而是一種道德態度，致力於他人的福祉，不論那個人是否可愛、有價值或有回應（見</w:t>
       </w:r>
-      <w:hyperlink r:id="rId82">
+      <w:hyperlink r:id="rId96">
         <w:r>
           <w:rPr>
             <w:lang w:val="zh_TW" w:bidi="zh_TW"/>
@@ -2932,7 +3596,7 @@
         </w:rPr>
         <w:t>這種持久的忠誠，根植於堅定不移的善意目的，可能是嚴厲的、決意要管教任性的子民，正如幾位先知所警告的。但神的愛不會改變。即使在被擄和失敗中，這愛仍以無限的耐心持續存在，既不縱容邪惡，也不放棄作惡者。這愛內含仁慈、溫柔和憐憫（</w:t>
       </w:r>
-      <w:hyperlink r:id="rId83">
+      <w:hyperlink r:id="rId97">
         <w:r>
           <w:rPr>
             <w:lang w:val="zh_TW" w:bidi="zh_TW"/>
@@ -2950,7 +3614,7 @@
         </w:rPr>
         <w:t>，</w:t>
       </w:r>
-      <w:hyperlink r:id="rId84">
+      <w:hyperlink r:id="rId98">
         <w:r>
           <w:rPr>
             <w:lang w:val="zh_TW" w:bidi="zh_TW"/>
@@ -2968,7 +3632,7 @@
         </w:rPr>
         <w:t>，</w:t>
       </w:r>
-      <w:hyperlink r:id="rId85">
+      <w:hyperlink r:id="rId99">
         <w:r>
           <w:rPr>
             <w:lang w:val="zh_TW" w:bidi="zh_TW"/>
@@ -2986,7 +3650,7 @@
         </w:rPr>
         <w:t>；</w:t>
       </w:r>
-      <w:hyperlink r:id="rId86">
+      <w:hyperlink r:id="rId100">
         <w:r>
           <w:rPr>
             <w:lang w:val="zh_TW" w:bidi="zh_TW"/>
@@ -3018,7 +3682,7 @@
         </w:rPr>
         <w:t>然而，神期待人有所回應。律法要求要全心全意地愛神，並感謝神對以色列的揀選和救贖（</w:t>
       </w:r>
-      <w:hyperlink r:id="rId87">
+      <w:hyperlink r:id="rId101">
         <w:r>
           <w:rPr>
             <w:lang w:val="zh_TW" w:bidi="zh_TW"/>
@@ -3036,7 +3700,7 @@
         </w:rPr>
         <w:t>）。這應該在敬拜中表現出來，尤其是在對待窮人、無助的人、寄居者、奴隸、寡婦以及所有受壓迫和殘酷對待的人時顯現出來。何西阿同樣期望人與人之間堅定的愛源於神對人的堅定不移的愛（</w:t>
       </w:r>
-      <w:hyperlink r:id="rId88">
+      <w:hyperlink r:id="rId102">
         <w:r>
           <w:rPr>
             <w:lang w:val="zh_TW" w:bidi="zh_TW"/>
@@ -3048,7 +3712,7 @@
           <w:t>何6:6，</w:t>
         </w:r>
       </w:hyperlink>
-      <w:hyperlink r:id="rId89">
+      <w:hyperlink r:id="rId103">
         <w:r>
           <w:rPr>
             <w:lang w:val="zh_TW" w:bidi="zh_TW"/>
@@ -3066,7 +3730,7 @@
         </w:rPr>
         <w:t>，</w:t>
       </w:r>
-      <w:hyperlink r:id="rId90">
+      <w:hyperlink r:id="rId104">
         <w:r>
           <w:rPr>
             <w:lang w:val="zh_TW" w:bidi="zh_TW"/>
@@ -3098,7 +3762,7 @@
         </w:rPr>
         <w:t>在以色列的律法和先知書中，「愛神」與「愛人如己」（</w:t>
       </w:r>
-      <w:hyperlink r:id="rId91">
+      <w:hyperlink r:id="rId105">
         <w:r>
           <w:rPr>
             <w:lang w:val="zh_TW" w:bidi="zh_TW"/>
@@ -3141,7 +3805,7 @@
         </w:rPr>
         <w:t>在描述愛的希臘詞彙中，eros（性愛）並未出現在新約中。Phileo表示自然的情感，出現約25次，philadelphia（兄弟之愛）出現5次，而philia（友誼）僅在</w:t>
       </w:r>
-      <w:hyperlink r:id="rId92">
+      <w:hyperlink r:id="rId106">
         <w:r>
           <w:rPr>
             <w:lang w:val="zh_TW" w:bidi="zh_TW"/>
@@ -3197,7 +3861,7 @@
         </w:rPr>
         <w:t>在罪惡和苦難的世界中，耶穌的神聖之愛最主要表現為對困苦者的同情和醫治，並對被排斥者和自我絕望者的救贖關懷。因此，基督所宣講的國度向貧窮的、被擄的、瞎眼的和受壓制的人提供了好消息（</w:t>
       </w:r>
-      <w:hyperlink r:id="rId93">
+      <w:hyperlink r:id="rId107">
         <w:r>
           <w:rPr>
             <w:lang w:val="zh_TW" w:bidi="zh_TW"/>
@@ -3215,7 +3879,7 @@
         </w:rPr>
         <w:t>；</w:t>
       </w:r>
-      <w:hyperlink r:id="rId94">
+      <w:hyperlink r:id="rId108">
         <w:r>
           <w:rPr>
             <w:lang w:val="zh_TW" w:bidi="zh_TW"/>
@@ -3233,7 +3897,7 @@
         </w:rPr>
         <w:t>），而耶穌對那些被排斥、被鄙視或在靈魂深處為罪而憂傷的人所採取的態度，則是保證了他們的罪得赦免，並歡迎他們回到天父的家（</w:t>
       </w:r>
-      <w:hyperlink r:id="rId95">
+      <w:hyperlink r:id="rId109">
         <w:r>
           <w:rPr>
             <w:lang w:val="zh_TW" w:bidi="zh_TW"/>
@@ -3265,7 +3929,7 @@
         </w:rPr>
         <w:t>此外，神聖之愛的好消息也帶來了我們自身的責任：愛神並像神那樣愛他人（</w:t>
       </w:r>
-      <w:hyperlink r:id="rId96">
+      <w:hyperlink r:id="rId110">
         <w:r>
           <w:rPr>
             <w:lang w:val="zh_TW" w:bidi="zh_TW"/>
@@ -3283,7 +3947,7 @@
         </w:rPr>
         <w:t>）。神的律法中的第一條也是最大的誡命是「你要……愛主你的神……其次也相倣，就是要愛人如己。這兩條誡命是律法和先知一切道理的總綱。」（</w:t>
       </w:r>
-      <w:hyperlink r:id="rId97">
+      <w:hyperlink r:id="rId111">
         <w:r>
           <w:rPr>
             <w:lang w:val="zh_TW" w:bidi="zh_TW"/>
@@ -3301,7 +3965,7 @@
         </w:rPr>
         <w:t>；參</w:t>
       </w:r>
-      <w:hyperlink r:id="rId91">
+      <w:hyperlink r:id="rId105">
         <w:r>
           <w:rPr>
             <w:lang w:val="zh_TW" w:bidi="zh_TW"/>
@@ -3319,7 +3983,7 @@
         </w:rPr>
         <w:t>；</w:t>
       </w:r>
-      <w:hyperlink r:id="rId98">
+      <w:hyperlink r:id="rId112">
         <w:r>
           <w:rPr>
             <w:lang w:val="zh_TW" w:bidi="zh_TW"/>
@@ -3365,7 +4029,7 @@
         </w:rPr>
         <w:t>對耶穌來說，最嚴重的罪是缺乏愛心，故意忽略任何可能的善行，在他人受苦時從旁邊走過，忽視門口的窮人，拒絕寬恕。缺乏愛心的罪被自以為義、好批評，以及為了維護一些微不足道的宗教儀式而忽略他人困境的宗教冷漠所加重。最後，順從或忽視愛的律法將決定每個人的永恆命運（</w:t>
       </w:r>
-      <w:hyperlink r:id="rId99">
+      <w:hyperlink r:id="rId113">
         <w:r>
           <w:rPr>
             <w:lang w:val="zh_TW" w:bidi="zh_TW"/>
@@ -3408,7 +4072,7 @@
         </w:rPr>
         <w:t>使徒教會迅速掌握了一個革命性原則，「愛」就是足夠了（Love is enough）。保羅宣稱愛成全了整個律法，幾乎是引用了耶穌的話。他對禁止姦淫、殺人、偷盜和貪婪的各種誡命的闡釋都用愛來總結，因為愛是不會做傷害鄰舍的事（</w:t>
       </w:r>
-      <w:hyperlink r:id="rId100">
+      <w:hyperlink r:id="rId114">
         <w:r>
           <w:rPr>
             <w:lang w:val="zh_TW" w:bidi="zh_TW"/>
@@ -3426,7 +4090,7 @@
         </w:rPr>
         <w:t>）。</w:t>
       </w:r>
-      <w:hyperlink r:id="rId101">
+      <w:hyperlink r:id="rId115">
         <w:r>
           <w:rPr>
             <w:lang w:val="zh_TW" w:bidi="zh_TW"/>
@@ -3458,7 +4122,7 @@
         </w:rPr>
         <w:t>對保羅來說，愛是「基督的律法」，是至高且足夠的（</w:t>
       </w:r>
-      <w:hyperlink r:id="rId102">
+      <w:hyperlink r:id="rId116">
         <w:r>
           <w:rPr>
             <w:lang w:val="zh_TW" w:bidi="zh_TW"/>
@@ -3476,7 +4140,7 @@
         </w:rPr>
         <w:t>，</w:t>
       </w:r>
-      <w:hyperlink r:id="rId103">
+      <w:hyperlink r:id="rId117">
         <w:r>
           <w:rPr>
             <w:lang w:val="zh_TW" w:bidi="zh_TW"/>
@@ -3494,7 +4158,7 @@
         </w:rPr>
         <w:t>），保羅清楚地定義基督教中唯一「有功效」的事情為「使人生發仁愛的信心」（</w:t>
       </w:r>
-      <w:hyperlink r:id="rId104">
+      <w:hyperlink r:id="rId118">
         <w:r>
           <w:rPr>
             <w:lang w:val="zh_TW" w:bidi="zh_TW"/>
@@ -3512,6 +4176,515 @@
         </w:rPr>
         <w:t>）。他堅持認為基督徒應當渴望的聖靈的最高彰顯是愛的「最妙的道」（</w:t>
       </w:r>
+      <w:hyperlink r:id="rId119">
+        <w:r>
+          <w:rPr>
+            <w:lang w:val="zh_TW" w:bidi="zh_TW"/>
+          </w:rPr>
+          <w:rPr>
+            <w:color w:val="0000EE"/>
+            <w:u w:val="single"/>
+          </w:rPr>
+          <w:t>林前12:27–13:13</w:t>
+        </w:r>
+      </w:hyperlink>
+      <w:r>
+        <w:rPr>
+          <w:lang w:val="zh_TW" w:bidi="zh_TW"/>
+        </w:rPr>
+        <w:t>；參</w:t>
+      </w:r>
+      <w:hyperlink r:id="rId120">
+        <w:r>
+          <w:rPr>
+            <w:lang w:val="zh_TW" w:bidi="zh_TW"/>
+          </w:rPr>
+          <w:rPr>
+            <w:color w:val="0000EE"/>
+            <w:u w:val="single"/>
+          </w:rPr>
+          <w:t>羅5:5</w:t>
+        </w:r>
+      </w:hyperlink>
+      <w:r>
+        <w:rPr>
+          <w:lang w:val="zh_TW" w:bidi="zh_TW"/>
+        </w:rPr>
+        <w:t>；</w:t>
+      </w:r>
+      <w:hyperlink r:id="rId121">
+        <w:r>
+          <w:rPr>
+            <w:lang w:val="zh_TW" w:bidi="zh_TW"/>
+          </w:rPr>
+          <w:rPr>
+            <w:color w:val="0000EE"/>
+            <w:u w:val="single"/>
+          </w:rPr>
+          <w:t>加5:22</w:t>
+        </w:r>
+      </w:hyperlink>
+      <w:r>
+        <w:rPr>
+          <w:lang w:val="zh_TW" w:bidi="zh_TW"/>
+        </w:rPr>
+        <w:t>）。在這裡，他還將愛與在哥林多所推崇的其它五種宗教熱情表達方式作對比，以顯示沒有愛的每一種熱情表達方式都是徒勞的（(</w:t>
+      </w:r>
+      <w:hyperlink r:id="rId122">
+        <w:r>
+          <w:rPr>
+            <w:lang w:val="zh_TW" w:bidi="zh_TW"/>
+          </w:rPr>
+          <w:rPr>
+            <w:color w:val="0000EE"/>
+            <w:u w:val="single"/>
+          </w:rPr>
+          <w:t>林前13:1–3</w:t>
+        </w:r>
+      </w:hyperlink>
+      <w:r>
+        <w:rPr>
+          <w:lang w:val="zh_TW" w:bidi="zh_TW"/>
+        </w:rPr>
+        <w:t>）。在本章的結尾，保羅將愛與信心和盼望（兩個宗教經驗中持久的元素）作比較，並宣告愛是最大的。</w:t>
+      </w:r>
+    </w:p>
+    <w:p>
+      <w:pPr/>
+      <w:r>
+        <w:rPr>
+          <w:lang w:val="zh_TW" w:bidi="zh_TW"/>
+        </w:rPr>
+      </w:r>
+      <w:r>
+        <w:rPr>
+          <w:lang w:val="zh_TW" w:bidi="zh_TW"/>
+        </w:rPr>
+        <w:t>保羅對愛在行為中的描述包括慷慨、憐憫和款待；避免報復；同情；與他人一同喜樂；分擔軟弱、羞恥或需要；恢復、支持和造就他人，給予他們一切的榮譽、善良、寬恕、鼓勵；克制批評，即使是對分裂的、過於謹慎的「軟弱弟兄」的批評——這個清單幾乎是無窮無盡的。更普遍地說，愛是一種活動的品質、一種思考的品質和一種受苦的品質（</w:t>
+      </w:r>
+      <w:hyperlink r:id="rId123">
+        <w:r>
+          <w:rPr>
+            <w:lang w:val="zh_TW" w:bidi="zh_TW"/>
+          </w:rPr>
+          <w:rPr>
+            <w:color w:val="0000EE"/>
+            <w:u w:val="single"/>
+          </w:rPr>
+          <w:t>林前13:4–8</w:t>
+        </w:r>
+      </w:hyperlink>
+      <w:r>
+        <w:rPr>
+          <w:lang w:val="zh_TW" w:bidi="zh_TW"/>
+        </w:rPr>
+        <w:t>）。簡言之，愛不做傷害別人的事，也不遺漏任何善事；它是神的律法。</w:t>
+      </w:r>
+    </w:p>
+    <w:p>
+      <w:pPr/>
+      <w:r>
+        <w:rPr>
+          <w:lang w:val="zh_TW" w:bidi="zh_TW"/>
+        </w:rPr>
+      </w:r>
+      <w:r>
+        <w:rPr>
+          <w:lang w:val="zh_TW" w:bidi="zh_TW"/>
+        </w:rPr>
+        <w:t>依據保羅的說法，神向我們顯明了祂的愛是因著基督為我們死。因著祂的大愛，使我們在基督裡活著；我們在這愛中生活，靠著它我們得勝，沒有什麼能使我們與這愛隔絕（</w:t>
+      </w:r>
+      <w:hyperlink r:id="rId124">
+        <w:r>
+          <w:rPr>
+            <w:lang w:val="zh_TW" w:bidi="zh_TW"/>
+          </w:rPr>
+          <w:rPr>
+            <w:color w:val="0000EE"/>
+            <w:u w:val="single"/>
+          </w:rPr>
+          <w:t>羅5:8</w:t>
+        </w:r>
+      </w:hyperlink>
+      <w:r>
+        <w:rPr>
+          <w:lang w:val="zh_TW" w:bidi="zh_TW"/>
+        </w:rPr>
+        <w:t>，</w:t>
+      </w:r>
+      <w:hyperlink r:id="rId125">
+        <w:r>
+          <w:rPr>
+            <w:lang w:val="zh_TW" w:bidi="zh_TW"/>
+          </w:rPr>
+          <w:rPr>
+            <w:color w:val="0000EE"/>
+            <w:u w:val="single"/>
+          </w:rPr>
+          <w:t>8:32–39</w:t>
+        </w:r>
+      </w:hyperlink>
+      <w:r>
+        <w:rPr>
+          <w:lang w:val="zh_TW" w:bidi="zh_TW"/>
+        </w:rPr>
+        <w:t>；</w:t>
+      </w:r>
+      <w:hyperlink r:id="rId126">
+        <w:r>
+          <w:rPr>
+            <w:lang w:val="zh_TW" w:bidi="zh_TW"/>
+          </w:rPr>
+          <w:rPr>
+            <w:color w:val="0000EE"/>
+            <w:u w:val="single"/>
+          </w:rPr>
+          <w:t>林後13:14</w:t>
+        </w:r>
+      </w:hyperlink>
+      <w:r>
+        <w:rPr>
+          <w:lang w:val="zh_TW" w:bidi="zh_TW"/>
+        </w:rPr>
+        <w:t>；</w:t>
+      </w:r>
+      <w:hyperlink r:id="rId127">
+        <w:r>
+          <w:rPr>
+            <w:lang w:val="zh_TW" w:bidi="zh_TW"/>
+          </w:rPr>
+          <w:rPr>
+            <w:color w:val="0000EE"/>
+            <w:u w:val="single"/>
+          </w:rPr>
+          <w:t>弗2:4</w:t>
+        </w:r>
+      </w:hyperlink>
+      <w:r>
+        <w:rPr>
+          <w:lang w:val="zh_TW" w:bidi="zh_TW"/>
+        </w:rPr>
+        <w:t>；</w:t>
+      </w:r>
+      <w:hyperlink r:id="rId128">
+        <w:r>
+          <w:rPr>
+            <w:lang w:val="zh_TW" w:bidi="zh_TW"/>
+          </w:rPr>
+          <w:rPr>
+            <w:color w:val="0000EE"/>
+            <w:u w:val="single"/>
+          </w:rPr>
+          <w:t>帖後2:16</w:t>
+        </w:r>
+      </w:hyperlink>
+      <w:r>
+        <w:rPr>
+          <w:lang w:val="zh_TW" w:bidi="zh_TW"/>
+        </w:rPr>
+        <w:t>；</w:t>
+      </w:r>
+      <w:hyperlink r:id="rId129">
+        <w:r>
+          <w:rPr>
+            <w:lang w:val="zh_TW" w:bidi="zh_TW"/>
+          </w:rPr>
+          <w:rPr>
+            <w:color w:val="0000EE"/>
+            <w:u w:val="single"/>
+          </w:rPr>
+          <w:t>多3:4–5</w:t>
+        </w:r>
+      </w:hyperlink>
+      <w:r>
+        <w:rPr>
+          <w:lang w:val="zh_TW" w:bidi="zh_TW"/>
+        </w:rPr>
+        <w:t>）。我們的愛反映了最初「澆灌在我們心裡」的愛（</w:t>
+      </w:r>
+      <w:hyperlink r:id="rId120">
+        <w:r>
+          <w:rPr>
+            <w:lang w:val="zh_TW" w:bidi="zh_TW"/>
+          </w:rPr>
+          <w:rPr>
+            <w:color w:val="0000EE"/>
+            <w:u w:val="single"/>
+          </w:rPr>
+          <w:t>羅5:5</w:t>
+        </w:r>
+      </w:hyperlink>
+      <w:r>
+        <w:rPr>
+          <w:lang w:val="zh_TW" w:bidi="zh_TW"/>
+        </w:rPr>
+        <w:t>），並且指向基督（</w:t>
+      </w:r>
+      <w:hyperlink r:id="rId130">
+        <w:r>
+          <w:rPr>
+            <w:lang w:val="zh_TW" w:bidi="zh_TW"/>
+          </w:rPr>
+          <w:rPr>
+            <w:color w:val="0000EE"/>
+            <w:u w:val="single"/>
+          </w:rPr>
+          <w:t>林前7章</w:t>
+        </w:r>
+      </w:hyperlink>
+      <w:r>
+        <w:rPr>
+          <w:lang w:val="zh_TW" w:bidi="zh_TW"/>
+        </w:rPr>
+        <w:t>，</w:t>
+      </w:r>
+      <w:hyperlink r:id="rId131">
+        <w:r>
+          <w:rPr>
+            <w:lang w:val="zh_TW" w:bidi="zh_TW"/>
+          </w:rPr>
+          <w:rPr>
+            <w:color w:val="0000EE"/>
+            <w:u w:val="single"/>
+          </w:rPr>
+          <w:t>16:22</w:t>
+        </w:r>
+      </w:hyperlink>
+      <w:r>
+        <w:rPr>
+          <w:lang w:val="zh_TW" w:bidi="zh_TW"/>
+        </w:rPr>
+        <w:t>；</w:t>
+      </w:r>
+      <w:hyperlink r:id="rId132">
+        <w:r>
+          <w:rPr>
+            <w:lang w:val="zh_TW" w:bidi="zh_TW"/>
+          </w:rPr>
+          <w:rPr>
+            <w:color w:val="0000EE"/>
+            <w:u w:val="single"/>
+          </w:rPr>
+          <w:t>弗6:24</w:t>
+        </w:r>
+      </w:hyperlink>
+      <w:r>
+        <w:rPr>
+          <w:lang w:val="zh_TW" w:bidi="zh_TW"/>
+        </w:rPr>
+        <w:t>）和他人，我們因著基督的緣故來愛他們。</w:t>
+      </w:r>
+    </w:p>
+    <w:p>
+      <w:pPr>
+        <w:pStyle w:val="Heading4"/>
+      </w:pPr>
+      <w:r>
+        <w:rPr>
+          <w:lang w:val="zh_TW" w:bidi="zh_TW"/>
+        </w:rPr>
+        <w:t>在約翰的著作中</w:t>
+      </w:r>
+    </w:p>
+    <w:p>
+      <w:pPr/>
+      <w:r>
+        <w:rPr>
+          <w:lang w:val="zh_TW" w:bidi="zh_TW"/>
+        </w:rPr>
+      </w:r>
+      <w:r>
+        <w:rPr>
+          <w:lang w:val="zh_TW" w:bidi="zh_TW"/>
+        </w:rPr>
+        <w:t>約翰後來回憶並反思的內容，構成了聖經中關於愛的教導的冠冕。對約翰來說，愛是所有事情的基礎——「神愛世人」（</w:t>
+      </w:r>
+      <w:hyperlink r:id="rId133">
+        <w:r>
+          <w:rPr>
+            <w:lang w:val="zh_TW" w:bidi="zh_TW"/>
+          </w:rPr>
+          <w:rPr>
+            <w:color w:val="0000EE"/>
+            <w:u w:val="single"/>
+          </w:rPr>
+          <w:t>約3:16</w:t>
+        </w:r>
+      </w:hyperlink>
+      <w:r>
+        <w:rPr>
+          <w:lang w:val="zh_TW" w:bidi="zh_TW"/>
+        </w:rPr>
+        <w:t>，</w:t>
+      </w:r>
+      <w:hyperlink r:id="rId134">
+        <w:r>
+          <w:rPr>
+            <w:lang w:val="zh_TW" w:bidi="zh_TW"/>
+          </w:rPr>
+          <w:rPr>
+            <w:color w:val="0000EE"/>
+            <w:u w:val="single"/>
+          </w:rPr>
+          <w:t>16:27</w:t>
+        </w:r>
+      </w:hyperlink>
+      <w:r>
+        <w:rPr>
+          <w:lang w:val="zh_TW" w:bidi="zh_TW"/>
+        </w:rPr>
+        <w:t>，</w:t>
+      </w:r>
+      <w:hyperlink r:id="rId135">
+        <w:r>
+          <w:rPr>
+            <w:lang w:val="zh_TW" w:bidi="zh_TW"/>
+          </w:rPr>
+          <w:rPr>
+            <w:color w:val="0000EE"/>
+            <w:u w:val="single"/>
+          </w:rPr>
+          <w:t>17:23</w:t>
+        </w:r>
+      </w:hyperlink>
+      <w:r>
+        <w:rPr>
+          <w:lang w:val="zh_TW" w:bidi="zh_TW"/>
+        </w:rPr>
+        <w:t>）。這就是我們認識愛的根本：基督為我們捨命（</w:t>
+      </w:r>
+      <w:hyperlink r:id="rId136">
+        <w:r>
+          <w:rPr>
+            <w:lang w:val="zh_TW" w:bidi="zh_TW"/>
+          </w:rPr>
+          <w:rPr>
+            <w:color w:val="0000EE"/>
+            <w:u w:val="single"/>
+          </w:rPr>
+          <w:t>約一3:16</w:t>
+        </w:r>
+      </w:hyperlink>
+      <w:r>
+        <w:rPr>
+          <w:lang w:val="zh_TW" w:bidi="zh_TW"/>
+        </w:rPr>
+        <w:t>）。父、子和門徒之間的相互的愛，一定是基督教的基本事實，因為神自己就是愛（</w:t>
+      </w:r>
+      <w:hyperlink r:id="rId137">
+        <w:r>
+          <w:rPr>
+            <w:lang w:val="zh_TW" w:bidi="zh_TW"/>
+          </w:rPr>
+          <w:rPr>
+            <w:color w:val="0000EE"/>
+            <w:u w:val="single"/>
+          </w:rPr>
+          <w:t>4:8、16</w:t>
+        </w:r>
+      </w:hyperlink>
+      <w:r>
+        <w:rPr>
+          <w:lang w:val="zh_TW" w:bidi="zh_TW"/>
+        </w:rPr>
+        <w:t>）。</w:t>
+      </w:r>
+    </w:p>
+    <w:p>
+      <w:pPr/>
+      <w:r>
+        <w:rPr>
+          <w:lang w:val="zh_TW" w:bidi="zh_TW"/>
+        </w:rPr>
+      </w:r>
+      <w:r>
+        <w:rPr>
+          <w:lang w:val="zh_TW" w:bidi="zh_TW"/>
+        </w:rPr>
+        <w:t>我們藉著道成肉身和十字架知道這一點（</w:t>
+      </w:r>
+      <w:hyperlink r:id="rId138">
+        <w:r>
+          <w:rPr>
+            <w:lang w:val="zh_TW" w:bidi="zh_TW"/>
+          </w:rPr>
+          <w:rPr>
+            <w:color w:val="0000EE"/>
+            <w:u w:val="single"/>
+          </w:rPr>
+          <w:t>約一4:9–10</w:t>
+        </w:r>
+      </w:hyperlink>
+      <w:r>
+        <w:rPr>
+          <w:lang w:val="zh_TW" w:bidi="zh_TW"/>
+        </w:rPr>
+        <w:t>）。因此我們知道並相信神對我們的愛，這愛本身是神聖的（「屬於神」）。因此，「凡有愛心的，都是由神而生」。「沒有愛心的，就不認識神」。 這樣的人「在黑暗裡」，「不屬神」，並且「仍然在死亡中」。 從來沒有人見過神；然而「我們若彼此相愛……神就住在我們裡面」，我們也住在神裡面。</w:t>
+      </w:r>
+    </w:p>
+    <w:p>
+      <w:pPr/>
+      <w:r>
+        <w:rPr>
+          <w:lang w:val="zh_TW" w:bidi="zh_TW"/>
+        </w:rPr>
+      </w:r>
+      <w:r>
+        <w:rPr>
+          <w:lang w:val="zh_TW" w:bidi="zh_TW"/>
+        </w:rPr>
+        <w:t>神的愛因此是優先且原初的；如果我們有愛，是「因為神先愛我們」。我們的愛首先是指向神的，約翰在對這種向神的愛進行測試時顯得特別徹底和嚴謹。它要求我們「不要愛世界」、「遵守他的話語和誡命」，我們要愛我們的基督徒弟兄姊妹。這是我們從基督那裡接受的誡命：「愛神的，也當愛弟兄」，因為「神既是這樣愛我們，我們也當彼此相愛」。約翰用12次強調了彼此忠誠和相愛的責任。的確，如果一個人對他的弟兄或姊妹關上心門，「愛神的心怎能存在他裡面呢？」</w:t>
+      </w:r>
+    </w:p>
+    <w:p>
+      <w:pPr/>
+      <w:r>
+        <w:rPr>
+          <w:lang w:val="zh_TW" w:bidi="zh_TW"/>
+        </w:rPr>
+      </w:r>
+      <w:r>
+        <w:rPr>
+          <w:lang w:val="zh_TW" w:bidi="zh_TW"/>
+        </w:rPr>
+        <w:t>這種對基督徒之間的互愛的強調，被認為是耶穌所要求的愛的一個嚴重限制。「你的弟兄」似乎取代了「你的鄰舍」。在這方面，耶穌在樓上（upper room，又稱為「樓房講論」）所給的誡命（</w:t>
+      </w:r>
+      <w:hyperlink r:id="rId139">
+        <w:r>
+          <w:rPr>
+            <w:lang w:val="zh_TW" w:bidi="zh_TW"/>
+          </w:rPr>
+          <w:rPr>
+            <w:color w:val="0000EE"/>
+            <w:u w:val="single"/>
+          </w:rPr>
+          <w:t>約13:34</w:t>
+        </w:r>
+      </w:hyperlink>
+      <w:r>
+        <w:rPr>
+          <w:lang w:val="zh_TW" w:bidi="zh_TW"/>
+        </w:rPr>
+        <w:t>）與在</w:t>
+      </w:r>
+      <w:hyperlink r:id="rId140">
+        <w:r>
+          <w:rPr>
+            <w:lang w:val="zh_TW" w:bidi="zh_TW"/>
+          </w:rPr>
+          <w:rPr>
+            <w:color w:val="0000EE"/>
+            <w:u w:val="single"/>
+          </w:rPr>
+          <w:t>馬太福音二十二章39節</w:t>
+        </w:r>
+      </w:hyperlink>
+      <w:r>
+        <w:rPr>
+          <w:lang w:val="zh_TW" w:bidi="zh_TW"/>
+        </w:rPr>
+        <w:t>（引用</w:t>
+      </w:r>
       <w:hyperlink r:id="rId105">
         <w:r>
           <w:rPr>
@@ -3521,25 +4694,93 @@
             <w:color w:val="0000EE"/>
             <w:u w:val="single"/>
           </w:rPr>
-          <w:t>林前12:27–13:13</w:t>
-        </w:r>
-      </w:hyperlink>
-      <w:r>
-        <w:rPr>
-          <w:lang w:val="zh_TW" w:bidi="zh_TW"/>
-        </w:rPr>
-        <w:t>；參</w:t>
-      </w:r>
-      <w:hyperlink r:id="rId106">
-        <w:r>
-          <w:rPr>
-            <w:lang w:val="zh_TW" w:bidi="zh_TW"/>
-          </w:rPr>
-          <w:rPr>
-            <w:color w:val="0000EE"/>
-            <w:u w:val="single"/>
-          </w:rPr>
-          <w:t>羅5:5</w:t>
+          <w:t>利19:18</w:t>
+        </w:r>
+      </w:hyperlink>
+      <w:r>
+        <w:rPr>
+          <w:lang w:val="zh_TW" w:bidi="zh_TW"/>
+        </w:rPr>
+        <w:t>）所給的誡命相比是「新的」，而當時的情況也解釋了為何如此。耶穌被出賣的那夜，被周圍世界的敵意、即將來臨的十字架刑罰和猶大的背叛所籠罩著。所有的未來都取決於11個門徒在社會壓力下的相互忠誠。到約翰寫書信的時候，新的背叛已經撕裂了教會。一種被稱為諾斯底主義的歪曲了的福音，本質上是知識主義和自負的，「不顧愛」（伊格那丟〔Ignatius〕），已經引誘了領袖和信徒（</w:t>
+      </w:r>
+      <w:hyperlink r:id="rId141">
+        <w:r>
+          <w:rPr>
+            <w:lang w:val="zh_TW" w:bidi="zh_TW"/>
+          </w:rPr>
+          <w:rPr>
+            <w:color w:val="0000EE"/>
+            <w:u w:val="single"/>
+          </w:rPr>
+          <w:t>約一2:19、26</w:t>
+        </w:r>
+      </w:hyperlink>
+      <w:r>
+        <w:rPr>
+          <w:lang w:val="zh_TW" w:bidi="zh_TW"/>
+        </w:rPr>
+        <w:t>）。彼此的忠誠再次顯得至關重要，約翰特意寫信以鞏固和維持使徒的團契（</w:t>
+      </w:r>
+      <w:hyperlink r:id="rId142">
+        <w:r>
+          <w:rPr>
+            <w:lang w:val="zh_TW" w:bidi="zh_TW"/>
+          </w:rPr>
+          <w:rPr>
+            <w:color w:val="0000EE"/>
+            <w:u w:val="single"/>
+          </w:rPr>
+          <w:t>約一1:3</w:t>
+        </w:r>
+      </w:hyperlink>
+      <w:r>
+        <w:rPr>
+          <w:lang w:val="zh_TW" w:bidi="zh_TW"/>
+        </w:rPr>
+        <w:t>）。</w:t>
+      </w:r>
+    </w:p>
+    <w:p>
+      <w:pPr/>
+      <w:r>
+        <w:rPr>
+          <w:lang w:val="zh_TW" w:bidi="zh_TW"/>
+        </w:rPr>
+      </w:r>
+      <w:r>
+        <w:rPr>
+          <w:lang w:val="zh_TW" w:bidi="zh_TW"/>
+        </w:rPr>
+        <w:t>然而，對基督徒弟兄的愛並不是排外的，而是引向更廣泛的愛（參</w:t>
+      </w:r>
+      <w:hyperlink r:id="rId143">
+        <w:r>
+          <w:rPr>
+            <w:lang w:val="zh_TW" w:bidi="zh_TW"/>
+          </w:rPr>
+          <w:rPr>
+            <w:color w:val="0000EE"/>
+            <w:u w:val="single"/>
+          </w:rPr>
+          <w:t>彼後1:7</w:t>
+        </w:r>
+      </w:hyperlink>
+      <w:r>
+        <w:rPr>
+          <w:lang w:val="zh_TW" w:bidi="zh_TW"/>
+        </w:rPr>
+        <w:t>）。約翰堅持神愛世人（</w:t>
+      </w:r>
+      <w:hyperlink r:id="rId133">
+        <w:r>
+          <w:rPr>
+            <w:lang w:val="zh_TW" w:bidi="zh_TW"/>
+          </w:rPr>
+          <w:rPr>
+            <w:color w:val="0000EE"/>
+            <w:u w:val="single"/>
+          </w:rPr>
+          <w:t>約3:16</w:t>
         </w:r>
       </w:hyperlink>
       <w:r>
@@ -3548,41 +4789,59 @@
         </w:rPr>
         <w:t>；</w:t>
       </w:r>
-      <w:hyperlink r:id="rId107">
-        <w:r>
-          <w:rPr>
-            <w:lang w:val="zh_TW" w:bidi="zh_TW"/>
-          </w:rPr>
-          <w:rPr>
-            <w:color w:val="0000EE"/>
-            <w:u w:val="single"/>
-          </w:rPr>
-          <w:t>加5:22</w:t>
-        </w:r>
-      </w:hyperlink>
-      <w:r>
-        <w:rPr>
-          <w:lang w:val="zh_TW" w:bidi="zh_TW"/>
-        </w:rPr>
-        <w:t>）。在這裡，他還將愛與在哥林多所推崇的其它五種宗教熱情表達方式作對比，以顯示沒有愛的每一種熱情表達方式都是徒勞的（(</w:t>
-      </w:r>
-      <w:hyperlink r:id="rId108">
-        <w:r>
-          <w:rPr>
-            <w:lang w:val="zh_TW" w:bidi="zh_TW"/>
-          </w:rPr>
-          <w:rPr>
-            <w:color w:val="0000EE"/>
-            <w:u w:val="single"/>
-          </w:rPr>
-          <w:t>林前13:1–3</w:t>
-        </w:r>
-      </w:hyperlink>
-      <w:r>
-        <w:rPr>
-          <w:lang w:val="zh_TW" w:bidi="zh_TW"/>
-        </w:rPr>
-        <w:t>）。在本章的結尾，保羅將愛與信心和盼望（兩個宗教經驗中持久的元素）作比較，並宣告愛是最大的。</w:t>
+      <w:hyperlink r:id="rId144">
+        <w:r>
+          <w:rPr>
+            <w:lang w:val="zh_TW" w:bidi="zh_TW"/>
+          </w:rPr>
+          <w:rPr>
+            <w:color w:val="0000EE"/>
+            <w:u w:val="single"/>
+          </w:rPr>
+          <w:t>約一2:2</w:t>
+        </w:r>
+      </w:hyperlink>
+      <w:r>
+        <w:rPr>
+          <w:lang w:val="zh_TW" w:bidi="zh_TW"/>
+        </w:rPr>
+        <w:t>，</w:t>
+      </w:r>
+      <w:hyperlink r:id="rId145">
+        <w:r>
+          <w:rPr>
+            <w:lang w:val="zh_TW" w:bidi="zh_TW"/>
+          </w:rPr>
+          <w:rPr>
+            <w:color w:val="0000EE"/>
+            <w:u w:val="single"/>
+          </w:rPr>
+          <w:t>4:14</w:t>
+        </w:r>
+      </w:hyperlink>
+      <w:r>
+        <w:rPr>
+          <w:lang w:val="zh_TW" w:bidi="zh_TW"/>
+        </w:rPr>
+        <w:t>）。此外，如果愛在基督徒團契內失敗，它在團契之外肯定不會蓬勃發展，而是會消失在空洞的隻言片語中（</w:t>
+      </w:r>
+      <w:hyperlink r:id="rId146">
+        <w:r>
+          <w:rPr>
+            <w:lang w:val="zh_TW" w:bidi="zh_TW"/>
+          </w:rPr>
+          <w:rPr>
+            <w:color w:val="0000EE"/>
+            <w:u w:val="single"/>
+          </w:rPr>
+          <w:t>約一3:18</w:t>
+        </w:r>
+      </w:hyperlink>
+      <w:r>
+        <w:rPr>
+          <w:lang w:val="zh_TW" w:bidi="zh_TW"/>
+        </w:rPr>
+        <w:t>）。</w:t>
       </w:r>
     </w:p>
     <w:p>
@@ -3596,68 +4855,18 @@
         <w:rPr>
           <w:lang w:val="zh_TW" w:bidi="zh_TW"/>
         </w:rPr>
-        <w:t>保羅對愛在行為中的描述包括慷慨、憐憫和款待；避免報復；同情；與他人一同喜樂；分擔軟弱、羞恥或需要；恢復、支持和造就他人，給予他們一切的榮譽、善良、寬恕、鼓勵；克制批評，即使是對分裂的、過於謹慎的「軟弱弟兄」的批評——這個清單幾乎是無窮無盡的。更普遍地說，愛是一種活動的品質、一種思考的品質和一種受苦的品質（</w:t>
-      </w:r>
-      <w:hyperlink r:id="rId109">
-        <w:r>
-          <w:rPr>
-            <w:lang w:val="zh_TW" w:bidi="zh_TW"/>
-          </w:rPr>
-          <w:rPr>
-            <w:color w:val="0000EE"/>
-            <w:u w:val="single"/>
-          </w:rPr>
-          <w:t>林前13:4–8</w:t>
-        </w:r>
-      </w:hyperlink>
-      <w:r>
-        <w:rPr>
-          <w:lang w:val="zh_TW" w:bidi="zh_TW"/>
-        </w:rPr>
-        <w:t>）。簡言之，愛不做傷害別人的事，也不遺漏任何善事；它是神的律法。</w:t>
-      </w:r>
-    </w:p>
-    <w:p>
-      <w:pPr/>
-      <w:r>
-        <w:rPr>
-          <w:lang w:val="zh_TW" w:bidi="zh_TW"/>
-        </w:rPr>
-      </w:r>
-      <w:r>
-        <w:rPr>
-          <w:lang w:val="zh_TW" w:bidi="zh_TW"/>
-        </w:rPr>
-        <w:t>依據保羅的說法，神向我們顯明了祂的愛是因著基督為我們死。因著祂的大愛，使我們在基督裡活著；我們在這愛中生活，靠著它我們得勝，沒有什麼能使我們與這愛隔絕（</w:t>
-      </w:r>
-      <w:hyperlink r:id="rId110">
-        <w:r>
-          <w:rPr>
-            <w:lang w:val="zh_TW" w:bidi="zh_TW"/>
-          </w:rPr>
-          <w:rPr>
-            <w:color w:val="0000EE"/>
-            <w:u w:val="single"/>
-          </w:rPr>
-          <w:t>羅5:8</w:t>
-        </w:r>
-      </w:hyperlink>
-      <w:r>
-        <w:rPr>
-          <w:lang w:val="zh_TW" w:bidi="zh_TW"/>
-        </w:rPr>
-        <w:t>，</w:t>
-      </w:r>
-      <w:hyperlink r:id="rId111">
-        <w:r>
-          <w:rPr>
-            <w:lang w:val="zh_TW" w:bidi="zh_TW"/>
-          </w:rPr>
-          <w:rPr>
-            <w:color w:val="0000EE"/>
-            <w:u w:val="single"/>
-          </w:rPr>
-          <w:t>8:32–39</w:t>
+        <w:t>在反駁諾斯底基督教的無愛自負時，約翰關心的是愛神和愛人的基本命令，因為這是真正基督徒生活的標準和終極目標。因此，他並未詳細描述愛的多方面表達。對於愛的行動描述，他想起了基督關於「遵守命令」和「捨命」犧牲的話（</w:t>
+      </w:r>
+      <w:hyperlink r:id="rId147">
+        <w:r>
+          <w:rPr>
+            <w:lang w:val="zh_TW" w:bidi="zh_TW"/>
+          </w:rPr>
+          <w:rPr>
+            <w:color w:val="0000EE"/>
+            <w:u w:val="single"/>
+          </w:rPr>
+          <w:t>約15:10、13</w:t>
         </w:r>
       </w:hyperlink>
       <w:r>
@@ -3666,230 +4875,7 @@
         </w:rPr>
         <w:t>；</w:t>
       </w:r>
-      <w:hyperlink r:id="rId112">
-        <w:r>
-          <w:rPr>
-            <w:lang w:val="zh_TW" w:bidi="zh_TW"/>
-          </w:rPr>
-          <w:rPr>
-            <w:color w:val="0000EE"/>
-            <w:u w:val="single"/>
-          </w:rPr>
-          <w:t>林後13:14</w:t>
-        </w:r>
-      </w:hyperlink>
-      <w:r>
-        <w:rPr>
-          <w:lang w:val="zh_TW" w:bidi="zh_TW"/>
-        </w:rPr>
-        <w:t>；</w:t>
-      </w:r>
-      <w:hyperlink r:id="rId113">
-        <w:r>
-          <w:rPr>
-            <w:lang w:val="zh_TW" w:bidi="zh_TW"/>
-          </w:rPr>
-          <w:rPr>
-            <w:color w:val="0000EE"/>
-            <w:u w:val="single"/>
-          </w:rPr>
-          <w:t>弗2:4</w:t>
-        </w:r>
-      </w:hyperlink>
-      <w:r>
-        <w:rPr>
-          <w:lang w:val="zh_TW" w:bidi="zh_TW"/>
-        </w:rPr>
-        <w:t>；</w:t>
-      </w:r>
-      <w:hyperlink r:id="rId114">
-        <w:r>
-          <w:rPr>
-            <w:lang w:val="zh_TW" w:bidi="zh_TW"/>
-          </w:rPr>
-          <w:rPr>
-            <w:color w:val="0000EE"/>
-            <w:u w:val="single"/>
-          </w:rPr>
-          <w:t>帖後2:16</w:t>
-        </w:r>
-      </w:hyperlink>
-      <w:r>
-        <w:rPr>
-          <w:lang w:val="zh_TW" w:bidi="zh_TW"/>
-        </w:rPr>
-        <w:t>；</w:t>
-      </w:r>
-      <w:hyperlink r:id="rId115">
-        <w:r>
-          <w:rPr>
-            <w:lang w:val="zh_TW" w:bidi="zh_TW"/>
-          </w:rPr>
-          <w:rPr>
-            <w:color w:val="0000EE"/>
-            <w:u w:val="single"/>
-          </w:rPr>
-          <w:t>多3:4–5</w:t>
-        </w:r>
-      </w:hyperlink>
-      <w:r>
-        <w:rPr>
-          <w:lang w:val="zh_TW" w:bidi="zh_TW"/>
-        </w:rPr>
-        <w:t>）。我們的愛反映了最初「澆灌在我們心裡」的愛（</w:t>
-      </w:r>
-      <w:hyperlink r:id="rId106">
-        <w:r>
-          <w:rPr>
-            <w:lang w:val="zh_TW" w:bidi="zh_TW"/>
-          </w:rPr>
-          <w:rPr>
-            <w:color w:val="0000EE"/>
-            <w:u w:val="single"/>
-          </w:rPr>
-          <w:t>羅5:5</w:t>
-        </w:r>
-      </w:hyperlink>
-      <w:r>
-        <w:rPr>
-          <w:lang w:val="zh_TW" w:bidi="zh_TW"/>
-        </w:rPr>
-        <w:t>），並且指向基督（</w:t>
-      </w:r>
-      <w:hyperlink r:id="rId116">
-        <w:r>
-          <w:rPr>
-            <w:lang w:val="zh_TW" w:bidi="zh_TW"/>
-          </w:rPr>
-          <w:rPr>
-            <w:color w:val="0000EE"/>
-            <w:u w:val="single"/>
-          </w:rPr>
-          <w:t>林前7章</w:t>
-        </w:r>
-      </w:hyperlink>
-      <w:r>
-        <w:rPr>
-          <w:lang w:val="zh_TW" w:bidi="zh_TW"/>
-        </w:rPr>
-        <w:t>，</w:t>
-      </w:r>
-      <w:hyperlink r:id="rId117">
-        <w:r>
-          <w:rPr>
-            <w:lang w:val="zh_TW" w:bidi="zh_TW"/>
-          </w:rPr>
-          <w:rPr>
-            <w:color w:val="0000EE"/>
-            <w:u w:val="single"/>
-          </w:rPr>
-          <w:t>16:22</w:t>
-        </w:r>
-      </w:hyperlink>
-      <w:r>
-        <w:rPr>
-          <w:lang w:val="zh_TW" w:bidi="zh_TW"/>
-        </w:rPr>
-        <w:t>；</w:t>
-      </w:r>
-      <w:hyperlink r:id="rId118">
-        <w:r>
-          <w:rPr>
-            <w:lang w:val="zh_TW" w:bidi="zh_TW"/>
-          </w:rPr>
-          <w:rPr>
-            <w:color w:val="0000EE"/>
-            <w:u w:val="single"/>
-          </w:rPr>
-          <w:t>弗6:24</w:t>
-        </w:r>
-      </w:hyperlink>
-      <w:r>
-        <w:rPr>
-          <w:lang w:val="zh_TW" w:bidi="zh_TW"/>
-        </w:rPr>
-        <w:t>）和他人，我們因著基督的緣故來愛他們。</w:t>
-      </w:r>
-    </w:p>
-    <w:p>
-      <w:pPr>
-        <w:pStyle w:val="Heading4"/>
-      </w:pPr>
-      <w:r>
-        <w:rPr>
-          <w:lang w:val="zh_TW" w:bidi="zh_TW"/>
-        </w:rPr>
-        <w:t>在約翰的著作中</w:t>
-      </w:r>
-    </w:p>
-    <w:p>
-      <w:pPr/>
-      <w:r>
-        <w:rPr>
-          <w:lang w:val="zh_TW" w:bidi="zh_TW"/>
-        </w:rPr>
-      </w:r>
-      <w:r>
-        <w:rPr>
-          <w:lang w:val="zh_TW" w:bidi="zh_TW"/>
-        </w:rPr>
-        <w:t>約翰後來回憶並反思的內容，構成了聖經中關於愛的教導的冠冕。對約翰來說，愛是所有事情的基礎——「神愛世人」（</w:t>
-      </w:r>
-      <w:hyperlink r:id="rId119">
-        <w:r>
-          <w:rPr>
-            <w:lang w:val="zh_TW" w:bidi="zh_TW"/>
-          </w:rPr>
-          <w:rPr>
-            <w:color w:val="0000EE"/>
-            <w:u w:val="single"/>
-          </w:rPr>
-          <w:t>約3:16</w:t>
-        </w:r>
-      </w:hyperlink>
-      <w:r>
-        <w:rPr>
-          <w:lang w:val="zh_TW" w:bidi="zh_TW"/>
-        </w:rPr>
-        <w:t>，</w:t>
-      </w:r>
-      <w:hyperlink r:id="rId120">
-        <w:r>
-          <w:rPr>
-            <w:lang w:val="zh_TW" w:bidi="zh_TW"/>
-          </w:rPr>
-          <w:rPr>
-            <w:color w:val="0000EE"/>
-            <w:u w:val="single"/>
-          </w:rPr>
-          <w:t>16:27</w:t>
-        </w:r>
-      </w:hyperlink>
-      <w:r>
-        <w:rPr>
-          <w:lang w:val="zh_TW" w:bidi="zh_TW"/>
-        </w:rPr>
-        <w:t>，</w:t>
-      </w:r>
-      <w:hyperlink r:id="rId121">
-        <w:r>
-          <w:rPr>
-            <w:lang w:val="zh_TW" w:bidi="zh_TW"/>
-          </w:rPr>
-          <w:rPr>
-            <w:color w:val="0000EE"/>
-            <w:u w:val="single"/>
-          </w:rPr>
-          <w:t>17:23</w:t>
-        </w:r>
-      </w:hyperlink>
-      <w:r>
-        <w:rPr>
-          <w:lang w:val="zh_TW" w:bidi="zh_TW"/>
-        </w:rPr>
-        <w:t>）。這就是我們認識愛的根本：基督為我們捨命（</w:t>
-      </w:r>
-      <w:hyperlink r:id="rId122">
+      <w:hyperlink r:id="rId136">
         <w:r>
           <w:rPr>
             <w:lang w:val="zh_TW" w:bidi="zh_TW"/>
@@ -3905,331 +4891,9 @@
         <w:rPr>
           <w:lang w:val="zh_TW" w:bidi="zh_TW"/>
         </w:rPr>
-        <w:t>）。父、子和門徒之間的相互的愛，一定是基督教的基本事實，因為神自己就是愛（</w:t>
-      </w:r>
-      <w:hyperlink r:id="rId123">
-        <w:r>
-          <w:rPr>
-            <w:lang w:val="zh_TW" w:bidi="zh_TW"/>
-          </w:rPr>
-          <w:rPr>
-            <w:color w:val="0000EE"/>
-            <w:u w:val="single"/>
-          </w:rPr>
-          <w:t>4:8、16</w:t>
-        </w:r>
-      </w:hyperlink>
-      <w:r>
-        <w:rPr>
-          <w:lang w:val="zh_TW" w:bidi="zh_TW"/>
-        </w:rPr>
-        <w:t>）。</w:t>
-      </w:r>
-    </w:p>
-    <w:p>
-      <w:pPr/>
-      <w:r>
-        <w:rPr>
-          <w:lang w:val="zh_TW" w:bidi="zh_TW"/>
-        </w:rPr>
-      </w:r>
-      <w:r>
-        <w:rPr>
-          <w:lang w:val="zh_TW" w:bidi="zh_TW"/>
-        </w:rPr>
-        <w:t>我們藉著道成肉身和十字架知道這一點（</w:t>
-      </w:r>
-      <w:hyperlink r:id="rId124">
-        <w:r>
-          <w:rPr>
-            <w:lang w:val="zh_TW" w:bidi="zh_TW"/>
-          </w:rPr>
-          <w:rPr>
-            <w:color w:val="0000EE"/>
-            <w:u w:val="single"/>
-          </w:rPr>
-          <w:t>約一4:9–10</w:t>
-        </w:r>
-      </w:hyperlink>
-      <w:r>
-        <w:rPr>
-          <w:lang w:val="zh_TW" w:bidi="zh_TW"/>
-        </w:rPr>
-        <w:t>）。因此我們知道並相信神對我們的愛，這愛本身是神聖的（「屬於神」）。因此，「凡有愛心的，都是由神而生」。「沒有愛心的，就不認識神」。 這樣的人「在黑暗裡」，「不屬神」，並且「仍然在死亡中」。 從來沒有人見過神；然而「我們若彼此相愛……神就住在我們裡面」，我們也住在神裡面。</w:t>
-      </w:r>
-    </w:p>
-    <w:p>
-      <w:pPr/>
-      <w:r>
-        <w:rPr>
-          <w:lang w:val="zh_TW" w:bidi="zh_TW"/>
-        </w:rPr>
-      </w:r>
-      <w:r>
-        <w:rPr>
-          <w:lang w:val="zh_TW" w:bidi="zh_TW"/>
-        </w:rPr>
-        <w:t>神的愛因此是優先且原初的；如果我們有愛，是「因為神先愛我們」。我們的愛首先是指向神的，約翰在對這種向神的愛進行測試時顯得特別徹底和嚴謹。它要求我們「不要愛世界」、「遵守他的話語和誡命」，我們要愛我們的基督徒弟兄姊妹。這是我們從基督那裡接受的誡命：「愛神的，也當愛弟兄」，因為「神既是這樣愛我們，我們也當彼此相愛」。約翰用12次強調了彼此忠誠和相愛的責任。的確，如果一個人對他的弟兄或姊妹關上心門，「愛神的心怎能存在他裡面呢？」</w:t>
-      </w:r>
-    </w:p>
-    <w:p>
-      <w:pPr/>
-      <w:r>
-        <w:rPr>
-          <w:lang w:val="zh_TW" w:bidi="zh_TW"/>
-        </w:rPr>
-      </w:r>
-      <w:r>
-        <w:rPr>
-          <w:lang w:val="zh_TW" w:bidi="zh_TW"/>
-        </w:rPr>
-        <w:t>這種對基督徒之間的互愛的強調，被認為是耶穌所要求的愛的一個嚴重限制。「你的弟兄」似乎取代了「你的鄰舍」。在這方面，耶穌在樓上（upper room，又稱為「樓房講論」）所給的誡命（</w:t>
-      </w:r>
-      <w:hyperlink r:id="rId125">
-        <w:r>
-          <w:rPr>
-            <w:lang w:val="zh_TW" w:bidi="zh_TW"/>
-          </w:rPr>
-          <w:rPr>
-            <w:color w:val="0000EE"/>
-            <w:u w:val="single"/>
-          </w:rPr>
-          <w:t>約13:34</w:t>
-        </w:r>
-      </w:hyperlink>
-      <w:r>
-        <w:rPr>
-          <w:lang w:val="zh_TW" w:bidi="zh_TW"/>
-        </w:rPr>
-        <w:t>）與在</w:t>
-      </w:r>
-      <w:hyperlink r:id="rId126">
-        <w:r>
-          <w:rPr>
-            <w:lang w:val="zh_TW" w:bidi="zh_TW"/>
-          </w:rPr>
-          <w:rPr>
-            <w:color w:val="0000EE"/>
-            <w:u w:val="single"/>
-          </w:rPr>
-          <w:t>馬太福音二十二章39節</w:t>
-        </w:r>
-      </w:hyperlink>
-      <w:r>
-        <w:rPr>
-          <w:lang w:val="zh_TW" w:bidi="zh_TW"/>
-        </w:rPr>
-        <w:t>（引用</w:t>
-      </w:r>
-      <w:hyperlink r:id="rId91">
-        <w:r>
-          <w:rPr>
-            <w:lang w:val="zh_TW" w:bidi="zh_TW"/>
-          </w:rPr>
-          <w:rPr>
-            <w:color w:val="0000EE"/>
-            <w:u w:val="single"/>
-          </w:rPr>
-          <w:t>利19:18</w:t>
-        </w:r>
-      </w:hyperlink>
-      <w:r>
-        <w:rPr>
-          <w:lang w:val="zh_TW" w:bidi="zh_TW"/>
-        </w:rPr>
-        <w:t>）所給的誡命相比是「新的」，而當時的情況也解釋了為何如此。耶穌被出賣的那夜，被周圍世界的敵意、即將來臨的十字架刑罰和猶大的背叛所籠罩著。所有的未來都取決於11個門徒在社會壓力下的相互忠誠。到約翰寫書信的時候，新的背叛已經撕裂了教會。一種被稱為諾斯底主義的歪曲了的福音，本質上是知識主義和自負的，「不顧愛」（伊格那丟〔Ignatius〕），已經引誘了領袖和信徒（</w:t>
-      </w:r>
-      <w:hyperlink r:id="rId127">
-        <w:r>
-          <w:rPr>
-            <w:lang w:val="zh_TW" w:bidi="zh_TW"/>
-          </w:rPr>
-          <w:rPr>
-            <w:color w:val="0000EE"/>
-            <w:u w:val="single"/>
-          </w:rPr>
-          <w:t>約一2:19、26</w:t>
-        </w:r>
-      </w:hyperlink>
-      <w:r>
-        <w:rPr>
-          <w:lang w:val="zh_TW" w:bidi="zh_TW"/>
-        </w:rPr>
-        <w:t>）。彼此的忠誠再次顯得至關重要，約翰特意寫信以鞏固和維持使徒的團契（</w:t>
-      </w:r>
-      <w:hyperlink r:id="rId128">
-        <w:r>
-          <w:rPr>
-            <w:lang w:val="zh_TW" w:bidi="zh_TW"/>
-          </w:rPr>
-          <w:rPr>
-            <w:color w:val="0000EE"/>
-            <w:u w:val="single"/>
-          </w:rPr>
-          <w:t>約一1:3</w:t>
-        </w:r>
-      </w:hyperlink>
-      <w:r>
-        <w:rPr>
-          <w:lang w:val="zh_TW" w:bidi="zh_TW"/>
-        </w:rPr>
-        <w:t>）。</w:t>
-      </w:r>
-    </w:p>
-    <w:p>
-      <w:pPr/>
-      <w:r>
-        <w:rPr>
-          <w:lang w:val="zh_TW" w:bidi="zh_TW"/>
-        </w:rPr>
-      </w:r>
-      <w:r>
-        <w:rPr>
-          <w:lang w:val="zh_TW" w:bidi="zh_TW"/>
-        </w:rPr>
-        <w:t>然而，對基督徒弟兄的愛並不是排外的，而是引向更廣泛的愛（參</w:t>
-      </w:r>
-      <w:hyperlink r:id="rId129">
-        <w:r>
-          <w:rPr>
-            <w:lang w:val="zh_TW" w:bidi="zh_TW"/>
-          </w:rPr>
-          <w:rPr>
-            <w:color w:val="0000EE"/>
-            <w:u w:val="single"/>
-          </w:rPr>
-          <w:t>彼後1:7</w:t>
-        </w:r>
-      </w:hyperlink>
-      <w:r>
-        <w:rPr>
-          <w:lang w:val="zh_TW" w:bidi="zh_TW"/>
-        </w:rPr>
-        <w:t>）。約翰堅持神愛世人（</w:t>
-      </w:r>
-      <w:hyperlink r:id="rId119">
-        <w:r>
-          <w:rPr>
-            <w:lang w:val="zh_TW" w:bidi="zh_TW"/>
-          </w:rPr>
-          <w:rPr>
-            <w:color w:val="0000EE"/>
-            <w:u w:val="single"/>
-          </w:rPr>
-          <w:t>約3:16</w:t>
-        </w:r>
-      </w:hyperlink>
-      <w:r>
-        <w:rPr>
-          <w:lang w:val="zh_TW" w:bidi="zh_TW"/>
-        </w:rPr>
-        <w:t>；</w:t>
-      </w:r>
-      <w:hyperlink r:id="rId130">
-        <w:r>
-          <w:rPr>
-            <w:lang w:val="zh_TW" w:bidi="zh_TW"/>
-          </w:rPr>
-          <w:rPr>
-            <w:color w:val="0000EE"/>
-            <w:u w:val="single"/>
-          </w:rPr>
-          <w:t>約一2:2</w:t>
-        </w:r>
-      </w:hyperlink>
-      <w:r>
-        <w:rPr>
-          <w:lang w:val="zh_TW" w:bidi="zh_TW"/>
-        </w:rPr>
-        <w:t>，</w:t>
-      </w:r>
-      <w:hyperlink r:id="rId131">
-        <w:r>
-          <w:rPr>
-            <w:lang w:val="zh_TW" w:bidi="zh_TW"/>
-          </w:rPr>
-          <w:rPr>
-            <w:color w:val="0000EE"/>
-            <w:u w:val="single"/>
-          </w:rPr>
-          <w:t>4:14</w:t>
-        </w:r>
-      </w:hyperlink>
-      <w:r>
-        <w:rPr>
-          <w:lang w:val="zh_TW" w:bidi="zh_TW"/>
-        </w:rPr>
-        <w:t>）。此外，如果愛在基督徒團契內失敗，它在團契之外肯定不會蓬勃發展，而是會消失在空洞的隻言片語中（</w:t>
-      </w:r>
-      <w:hyperlink r:id="rId132">
-        <w:r>
-          <w:rPr>
-            <w:lang w:val="zh_TW" w:bidi="zh_TW"/>
-          </w:rPr>
-          <w:rPr>
-            <w:color w:val="0000EE"/>
-            <w:u w:val="single"/>
-          </w:rPr>
-          <w:t>約一3:18</w:t>
-        </w:r>
-      </w:hyperlink>
-      <w:r>
-        <w:rPr>
-          <w:lang w:val="zh_TW" w:bidi="zh_TW"/>
-        </w:rPr>
-        <w:t>）。</w:t>
-      </w:r>
-    </w:p>
-    <w:p>
-      <w:pPr/>
-      <w:r>
-        <w:rPr>
-          <w:lang w:val="zh_TW" w:bidi="zh_TW"/>
-        </w:rPr>
-      </w:r>
-      <w:r>
-        <w:rPr>
-          <w:lang w:val="zh_TW" w:bidi="zh_TW"/>
-        </w:rPr>
-        <w:t>在反駁諾斯底基督教的無愛自負時，約翰關心的是愛神和愛人的基本命令，因為這是真正基督徒生活的標準和終極目標。因此，他並未詳細描述愛的多方面表達。對於愛的行動描述，他想起了基督關於「遵守命令」和「捨命」犧牲的話（</w:t>
-      </w:r>
-      <w:hyperlink r:id="rId133">
-        <w:r>
-          <w:rPr>
-            <w:lang w:val="zh_TW" w:bidi="zh_TW"/>
-          </w:rPr>
-          <w:rPr>
-            <w:color w:val="0000EE"/>
-            <w:u w:val="single"/>
-          </w:rPr>
-          <w:t>約15:10、13</w:t>
-        </w:r>
-      </w:hyperlink>
-      <w:r>
-        <w:rPr>
-          <w:lang w:val="zh_TW" w:bidi="zh_TW"/>
-        </w:rPr>
-        <w:t>；</w:t>
-      </w:r>
-      <w:hyperlink r:id="rId122">
-        <w:r>
-          <w:rPr>
-            <w:lang w:val="zh_TW" w:bidi="zh_TW"/>
-          </w:rPr>
-          <w:rPr>
-            <w:color w:val="0000EE"/>
-            <w:u w:val="single"/>
-          </w:rPr>
-          <w:t>約一3:16</w:t>
-        </w:r>
-      </w:hyperlink>
-      <w:r>
-        <w:rPr>
-          <w:lang w:val="zh_TW" w:bidi="zh_TW"/>
-        </w:rPr>
         <w:t>），約翰特別提到愛會體察到弟兄的需要，因此會分享世上的財物（見</w:t>
       </w:r>
-      <w:hyperlink r:id="rId134">
+      <w:hyperlink r:id="rId148">
         <w:r>
           <w:rPr>
             <w:lang w:val="zh_TW" w:bidi="zh_TW"/>
@@ -6237,6 +6901,12 @@
       <w:startOverride w:val="1"/>
     </w:lvlOverride>
   </w:num>
+  <w:num w:numId="15">
+    <w:abstractNumId w:val="3"/>
+    <w:lvlOverride w:ilvl="0">
+      <w:startOverride w:val="1"/>
+    </w:lvlOverride>
+  </w:num>
   <w:numIdMacAtCleanup w:val="10"/>
 </w:numbering>
 </file>

</xml_diff>